<commit_message>
Keep the Results and Discussion draft to what the data shows
Separate the internet problems respondents met from concerns they raised,
state that hosted load time was not measured, note that the automated tests
were written by the researchers and run locally, list TC-002, TC-051 and
TC-062 as passed with remarks, and correct the counts of what respondents
liked.

Co-Authored-By: Claude Opus 5.5 <noreply@anthropic.com>
</commit_message>
<xml_diff>
--- a/00 - Manuscript/EduCheck_Results_and_Discussion_Draft.docx
+++ b/00 - Manuscript/EduCheck_Results_and_Discussion_Draft.docx
@@ -2250,7 +2250,7 @@
           <w:sz w:val="24"/>
           <w:szCs w:val="24"/>
         </w:rPr>
-        <w:t xml:space="preserve">All 76 test cases passed, a pass rate of 100%. During user acceptance testing, five defects were recorded in the defect log (Appendix _). Four were corrected: unclear messages when a section or account could not be deleted, the absence of an upload status for each subject, the absence of help and support information, and the absence of a section column and filter in Submission Review. The fifth, the slow first load of the hosted system after a period of inactivity, is a limitation of the free hosting plan; the login page now informs the user while the server starts.</w:t>
+        <w:t xml:space="preserve">All 76 test cases passed, a pass rate of 100%. The automated test cases were written and run by the researchers on a local copy of the system, not on the hosted system. Three of them passed with remarks: in TC-002 the error message was worded differently from the test case, although it also did not reveal which field was wrong; in TC-051 the unread count in the sidebar was updated only after the page was refreshed; and TC-062 was measured on the local server, while the first load of the hosted system remained slow (DEF-003). During user acceptance testing, five defects were recorded in the defect log (Appendix _). Four were corrected: unclear messages when a section or account could not be deleted, the absence of an upload status for each subject, the absence of help and support information, and the absence of a section column and filter in Submission Review. The fifth, the slow first load of the hosted system after a period of inactivity, is a limitation of the free hosting plan; the login page now informs the user while the server starts.</w:t>
       </w:r>
     </w:p>
     <w:p>
@@ -3308,7 +3308,7 @@
           <w:sz w:val="24"/>
           <w:szCs w:val="24"/>
         </w:rPr>
-        <w:t xml:space="preserve">The respondents rated each statement on a five-point Likert scale [ref: ISO/IEC 25010]. The weighted mean of each statement and characteristic was interpreted using Table 4. Answers of N/A were excluded from the mean. School personnel rated six characteristics; the IT expert also rated the four technical characteristics (maintainability, portability, safety, and technical security) after reviewing the setup guide and the source code.</w:t>
+        <w:t xml:space="preserve">The respondents rated each statement on a five-point Likert scale [ref: ISO/IEC 25010]. The weighted mean of each statement and characteristic was interpreted using Table 4. Answers of N/A were excluded from the mean. School personnel rated six characteristics; the IT expert also rated the four technical characteristics (maintainability, portability, safety, and technical security), which the questionnaire asked IT experts to answer after reviewing the setup guide and the source code.</w:t>
       </w:r>
     </w:p>
     <w:p>
@@ -14165,7 +14165,7 @@
           <w:sz w:val="24"/>
           <w:szCs w:val="24"/>
         </w:rPr>
-        <w:t xml:space="preserve">The lowest-rated characteristic among the school personnel was Performance Efficiency (4.04, Agree). Its lowest statements were "EduCheck stays responsive when working with a whole class of learners" (3.79) and "The mobile app runs smoothly on my phone without slowing it down" (3.86). The open-ended answers explain these ratings: six respondents mentioned a weak or unstable internet connection, and one mentioned downtime of the website. Because the testing was conducted online, the speed that respondents experienced depended on their connection and on the free hosting plan, whose server sleeps after a period of inactivity and takes up to a minute to start again. In the automated test on a local server, the main pages loaded with their data within seconds. Performance on the respondents' actual connections is therefore a limitation of the deployment, not of the system's processing, and paid hosting or a school server is recommended for actual use.</w:t>
+        <w:t xml:space="preserve">The lowest-rated characteristic among the school personnel was Performance Efficiency (4.04, Agree). Its lowest statements were "EduCheck stays responsive when working with a whole class of learners" (3.79) and "The mobile app runs smoothly on my phone without slowing it down" (3.86). In the open-ended answers, six respondents mentioned the internet connection: two listed it as a problem they encountered, while four raised it as a concern for schools with a weak signal. One respondent reported downtime of the website. Because the testing was conducted online, the speed that respondents experienced depended on their connection and on the free hosting plan, whose server sleeps after a period of inactivity and takes up to a minute to start again. In the automated test on a local server, the main pages loaded with their data within seconds, but the load time on the hosted system was not measured. The slow first load of the hosted system remains an open issue (DEF-003), and paid hosting or a school server is recommended for actual use.</w:t>
       </w:r>
     </w:p>
     <w:p>
@@ -14195,7 +14195,7 @@
           <w:sz w:val="24"/>
           <w:szCs w:val="24"/>
         </w:rPr>
-        <w:t xml:space="preserve">Among the technical characteristics rated by the IT expert, Portability (Flexibility) received the lowest rating (4.25, Strongly Agree). Its statements rated 4.00 (Agree) were "The system can be installed on another computer by following its setup guide"; "Settings such as the database, server address, and email are changed in a configuration file, not in the code"; "The mobile app installs and runs on different Android phones". Installing the system on another computer and running the mobile app on other phones were not tested as fully as the main functions, so a more detailed setup guide and testing on more Android devices are recommended.</w:t>
+        <w:t xml:space="preserve">Among the technical characteristics rated by the IT expert, Portability (Flexibility) received the lowest rating (4.25, Strongly Agree). Its statements rated 4.00 (Agree) were "The system can be installed on another computer by following its setup guide"; "Settings such as the database, server address, and email are changed in a configuration file, not in the code"; "The mobile app installs and runs on different Android phones". These ratings suggest that a more detailed setup guide and testing on more Android devices would make the system easier to install and maintain.</w:t>
       </w:r>
     </w:p>
     <w:p>
@@ -17063,7 +17063,7 @@
           <w:sz w:val="24"/>
           <w:szCs w:val="24"/>
         </w:rPr>
-        <w:t xml:space="preserve">This pattern is consistent with the lowest ISO/IEC 25010 statement on learnability and with the requests for training in the open-ended answers. It also explains why the SUS score is lower than the ISO/IEC 25010 usability rating (4.35, Strongly Agree): the ISO/IEC 25010 statements asked about specific qualities of the interface, such as clear labels, helpful messages, and readable layout, while the SUS measures overall perceived ease of use, including how easy the system is to learn. Most respondents were using EduCheck for the first time, and some were not confident with computers; one respondent answered Neutral to every ISO/IEC 25010 statement and wrote "Not good in computers." The welcome guide, Help and Support page, and User's Manual added after the evaluation address this finding. A short orientation before deployment and a second SUS evaluation after it are recommended.</w:t>
+        <w:t xml:space="preserve">This pattern is consistent with the lowest ISO/IEC 25010 statement on learnability and with the requests for training in the open-ended answers. It may also explain why the SUS score is lower than the ISO/IEC 25010 usability rating (4.35, Strongly Agree): the ISO/IEC 25010 statements asked about specific qualities of the interface, such as clear labels, helpful messages, and readable layout, while the SUS measures overall perceived ease of use, including how easy the system is to learn. EduCheck was new to all the respondents, and some were not confident with computers; one respondent answered Neutral to almost every ISO/IEC 25010 statement and wrote "Not good in computers." The welcome guide, Help and Support page, and User's Manual added after the evaluation are intended to address this finding, but their effect has not yet been measured. A short orientation before deployment and a second SUS evaluation after it are recommended.</w:t>
       </w:r>
     </w:p>
     <w:p>
@@ -18331,7 +18331,7 @@
           <w:sz w:val="24"/>
           <w:szCs w:val="24"/>
         </w:rPr>
-        <w:t xml:space="preserve">The respondents most often liked the integrated workflow from upload to approval, the intervention and performance analytics, the generation of the SF10, and the acceptance of the official DepEd e-Class Record format. The most common concerns were the internet connection (six respondents, plus one who mentioned website downtime), the need for training or clearer instructions (six respondents), and the storage capacity for the many uploaded files (two respondents). Three respondents suggested supporting the descriptive grading used from Kindergarten to Grade 3, and one suggested extending the system to high school teachers. These suggestions are outside the scope of the study and are included in the recommendations for future researchers.</w:t>
+        <w:t xml:space="preserve">In the open-ended answers, the respondents liked that EduCheck is easy to use and makes grading and record checking faster and more organized (four respondents), the intervention and performance analytics (three), the integrated workflow from upload to approval (three), the consolidation of grades and generation of the SF10 (one), and the acceptance of the official DepEd e-Class Record format (one). The most common concerns were the internet connection (six respondents, plus one who mentioned website downtime), the need for training or clearer instructions (six respondents), and the storage capacity for the many uploaded files (two respondents). Three respondents suggested supporting the descriptive grading used from Kindergarten to Grade 3, and one suggested extending the system to high school teachers. These suggestions are outside the scope of the study and are included in the recommendations for future researchers.</w:t>
       </w:r>
     </w:p>
     <w:p>

</xml_diff>

<commit_message>
Add white-box tests for every validator rule and measure code coverage
Coverage showed several validation rules no test had reached (score above
the highest possible score, wrong final grade, summary/term mismatch, empty
sheets). WB-01 to WB-22 test each branch of the validator; all pass, so no
defect was found. npm run coverage (c8) measures the tests and the spawned
server together: 85.45% statements, 80.95% branches; the validator is at
100% statements. The Results and Discussion draft reports 32 white-box and
173 grey-box tests with these figures.

Co-Authored-By: Claude Opus 5.5 <noreply@anthropic.com>
</commit_message>
<xml_diff>
--- a/00 - Manuscript/EduCheck_Results_and_Discussion_Draft.docx
+++ b/00 - Manuscript/EduCheck_Results_and_Discussion_Draft.docx
@@ -515,7 +515,7 @@
                 <w:sz w:val="20"/>
                 <w:szCs w:val="20"/>
               </w:rPr>
-              <w:t xml:space="preserve">10</w:t>
+              <w:t xml:space="preserve">32</w:t>
             </w:r>
           </w:p>
         </w:tc>
@@ -545,7 +545,7 @@
                 <w:sz w:val="20"/>
                 <w:szCs w:val="20"/>
               </w:rPr>
-              <w:t xml:space="preserve">10</w:t>
+              <w:t xml:space="preserve">32</w:t>
             </w:r>
           </w:p>
         </w:tc>
@@ -831,7 +831,7 @@
                 <w:sz w:val="20"/>
                 <w:szCs w:val="20"/>
               </w:rPr>
-              <w:t xml:space="preserve">259</w:t>
+              <w:t xml:space="preserve">281</w:t>
             </w:r>
           </w:p>
         </w:tc>
@@ -863,7 +863,7 @@
                 <w:sz w:val="20"/>
                 <w:szCs w:val="20"/>
               </w:rPr>
-              <w:t xml:space="preserve">259</w:t>
+              <w:t xml:space="preserve">281</w:t>
             </w:r>
           </w:p>
         </w:tc>
@@ -2282,9 +2282,579 @@
           <w:sz w:val="24"/>
           <w:szCs w:val="24"/>
         </w:rPr>
-        <w:t xml:space="preserve">White box testing examined the internal logic of the rule-based validation engine, which is the core of EduCheck. 10 unit tests called the internal functions directly and were designed from their decision paths: reading learners, LRNs, and grades from the official DepEd e-Class Record; flagging invalid grades and missing data; matching the subject and grade level in the file header; and filling the SF10 form. All 10 tests passed.</w:t>
+        <w:t xml:space="preserve">White box testing examined the internal logic of the rule-based validation engine, which is the core of EduCheck. Its unit tests call the internal functions directly: reading learners, LRNs, and grades from the official DepEd e-Class Record; applying the validation rules; matching the subject and grade level in the file header; and filling the SF10 form. Code coverage was measured to show which parts of the code the tests actually ran. The first measurement showed that the validator had 80.06% statement and 79.41% branch coverage: some validation rules, such as a score above the highest possible score, a wrong final grade, and a Summary of Grades that disagrees with the term sheets, had never been reached by any test. Twenty-two test cases (WB-01 to WB-22) were then designed from the branches of the validator, one path at a time, raising its coverage to 100% of statements and 95.94% of branches. All 32 white-box tests passed, so the previously untested rules were confirmed to work as designed (Appendix _).</w:t>
       </w:r>
     </w:p>
+    <w:p>
+      <w:pPr>
+        <w:spacing w:after="160" w:line="360"/>
+        <w:ind w:firstLine="720"/>
+        <w:jc w:val="both"/>
+      </w:pPr>
+      <w:r>
+        <w:rPr>
+          <w:rFonts w:ascii="Times New Roman" w:cs="Times New Roman" w:eastAsia="Times New Roman" w:hAnsi="Times New Roman"/>
+          <w:sz w:val="24"/>
+          <w:szCs w:val="24"/>
+        </w:rPr>
+        <w:t xml:space="preserve">Table 3 shows the code coverage reached by all the server tests together.</w:t>
+      </w:r>
+    </w:p>
+    <w:p>
+      <w:pPr>
+        <w:keepNext/>
+        <w:spacing w:before="200" w:after="80"/>
+      </w:pPr>
+      <w:r>
+        <w:rPr>
+          <w:rFonts w:ascii="Times New Roman" w:cs="Times New Roman" w:eastAsia="Times New Roman" w:hAnsi="Times New Roman"/>
+          <w:b/>
+          <w:bCs/>
+          <w:sz w:val="22"/>
+          <w:szCs w:val="22"/>
+        </w:rPr>
+        <w:t xml:space="preserve">Table 3. Code coverage of the server</w:t>
+      </w:r>
+    </w:p>
+    <w:tbl>
+      <w:tblPr>
+        <w:tblW w:type="pct" w:w="100%"/>
+        <w:tblBorders>
+          <w:top w:val="single" w:color="auto" w:sz="4"/>
+          <w:left w:val="single" w:color="auto" w:sz="4"/>
+          <w:bottom w:val="single" w:color="auto" w:sz="4"/>
+          <w:right w:val="single" w:color="auto" w:sz="4"/>
+          <w:insideH w:val="single" w:color="auto" w:sz="4"/>
+          <w:insideV w:val="single" w:color="auto" w:sz="4"/>
+        </w:tblBorders>
+      </w:tblPr>
+      <w:tblGrid>
+        <w:gridCol w:w="100"/>
+        <w:gridCol w:w="100"/>
+        <w:gridCol w:w="100"/>
+        <w:gridCol w:w="100"/>
+      </w:tblGrid>
+      <w:tr>
+        <w:trPr>
+          <w:tblHeader/>
+        </w:trPr>
+        <w:tc>
+          <w:tcPr>
+            <w:tcW w:type="pct" w:w="55%"/>
+            <w:tcBorders>
+              <w:top w:val="single" w:color="BFBFBF" w:sz="4"/>
+              <w:left w:val="single" w:color="BFBFBF" w:sz="4"/>
+              <w:bottom w:val="single" w:color="BFBFBF" w:sz="4"/>
+              <w:right w:val="single" w:color="BFBFBF" w:sz="4"/>
+            </w:tcBorders>
+            <w:shd w:fill="D9E2F3" w:color="auto" w:val="clear"/>
+            <w:tcMar>
+              <w:top w:type="dxa" w:w="40"/>
+              <w:left w:type="dxa" w:w="80"/>
+              <w:bottom w:type="dxa" w:w="40"/>
+              <w:right w:type="dxa" w:w="80"/>
+            </w:tcMar>
+          </w:tcPr>
+          <w:p>
+            <w:pPr>
+              <w:jc w:val="left"/>
+            </w:pPr>
+            <w:r>
+              <w:rPr>
+                <w:rFonts w:ascii="Times New Roman" w:cs="Times New Roman" w:eastAsia="Times New Roman" w:hAnsi="Times New Roman"/>
+                <w:b/>
+                <w:bCs/>
+                <w:sz w:val="20"/>
+                <w:szCs w:val="20"/>
+              </w:rPr>
+              <w:t xml:space="preserve">Part of the server</w:t>
+            </w:r>
+          </w:p>
+        </w:tc>
+        <w:tc>
+          <w:tcPr>
+            <w:tcW w:type="pct" w:w="15%"/>
+            <w:tcBorders>
+              <w:top w:val="single" w:color="BFBFBF" w:sz="4"/>
+              <w:left w:val="single" w:color="BFBFBF" w:sz="4"/>
+              <w:bottom w:val="single" w:color="BFBFBF" w:sz="4"/>
+              <w:right w:val="single" w:color="BFBFBF" w:sz="4"/>
+            </w:tcBorders>
+            <w:shd w:fill="D9E2F3" w:color="auto" w:val="clear"/>
+            <w:tcMar>
+              <w:top w:type="dxa" w:w="40"/>
+              <w:left w:type="dxa" w:w="80"/>
+              <w:bottom w:type="dxa" w:w="40"/>
+              <w:right w:type="dxa" w:w="80"/>
+            </w:tcMar>
+          </w:tcPr>
+          <w:p>
+            <w:pPr>
+              <w:jc w:val="center"/>
+            </w:pPr>
+            <w:r>
+              <w:rPr>
+                <w:rFonts w:ascii="Times New Roman" w:cs="Times New Roman" w:eastAsia="Times New Roman" w:hAnsi="Times New Roman"/>
+                <w:b/>
+                <w:bCs/>
+                <w:sz w:val="20"/>
+                <w:szCs w:val="20"/>
+              </w:rPr>
+              <w:t xml:space="preserve">Statements</w:t>
+            </w:r>
+          </w:p>
+        </w:tc>
+        <w:tc>
+          <w:tcPr>
+            <w:tcW w:type="pct" w:w="15%"/>
+            <w:tcBorders>
+              <w:top w:val="single" w:color="BFBFBF" w:sz="4"/>
+              <w:left w:val="single" w:color="BFBFBF" w:sz="4"/>
+              <w:bottom w:val="single" w:color="BFBFBF" w:sz="4"/>
+              <w:right w:val="single" w:color="BFBFBF" w:sz="4"/>
+            </w:tcBorders>
+            <w:shd w:fill="D9E2F3" w:color="auto" w:val="clear"/>
+            <w:tcMar>
+              <w:top w:type="dxa" w:w="40"/>
+              <w:left w:type="dxa" w:w="80"/>
+              <w:bottom w:type="dxa" w:w="40"/>
+              <w:right w:type="dxa" w:w="80"/>
+            </w:tcMar>
+          </w:tcPr>
+          <w:p>
+            <w:pPr>
+              <w:jc w:val="center"/>
+            </w:pPr>
+            <w:r>
+              <w:rPr>
+                <w:rFonts w:ascii="Times New Roman" w:cs="Times New Roman" w:eastAsia="Times New Roman" w:hAnsi="Times New Roman"/>
+                <w:b/>
+                <w:bCs/>
+                <w:sz w:val="20"/>
+                <w:szCs w:val="20"/>
+              </w:rPr>
+              <w:t xml:space="preserve">Branches</w:t>
+            </w:r>
+          </w:p>
+        </w:tc>
+        <w:tc>
+          <w:tcPr>
+            <w:tcW w:type="pct" w:w="15%"/>
+            <w:tcBorders>
+              <w:top w:val="single" w:color="BFBFBF" w:sz="4"/>
+              <w:left w:val="single" w:color="BFBFBF" w:sz="4"/>
+              <w:bottom w:val="single" w:color="BFBFBF" w:sz="4"/>
+              <w:right w:val="single" w:color="BFBFBF" w:sz="4"/>
+            </w:tcBorders>
+            <w:shd w:fill="D9E2F3" w:color="auto" w:val="clear"/>
+            <w:tcMar>
+              <w:top w:type="dxa" w:w="40"/>
+              <w:left w:type="dxa" w:w="80"/>
+              <w:bottom w:type="dxa" w:w="40"/>
+              <w:right w:type="dxa" w:w="80"/>
+            </w:tcMar>
+          </w:tcPr>
+          <w:p>
+            <w:pPr>
+              <w:jc w:val="center"/>
+            </w:pPr>
+            <w:r>
+              <w:rPr>
+                <w:rFonts w:ascii="Times New Roman" w:cs="Times New Roman" w:eastAsia="Times New Roman" w:hAnsi="Times New Roman"/>
+                <w:b/>
+                <w:bCs/>
+                <w:sz w:val="20"/>
+                <w:szCs w:val="20"/>
+              </w:rPr>
+              <w:t xml:space="preserve">Functions</w:t>
+            </w:r>
+          </w:p>
+        </w:tc>
+      </w:tr>
+      <w:tr>
+        <w:trPr>
+          <w:cantSplit/>
+        </w:trPr>
+        <w:tc>
+          <w:tcPr>
+            <w:tcW w:type="pct" w:w="55%"/>
+            <w:tcBorders>
+              <w:top w:val="single" w:color="BFBFBF" w:sz="4"/>
+              <w:left w:val="single" w:color="BFBFBF" w:sz="4"/>
+              <w:bottom w:val="single" w:color="BFBFBF" w:sz="4"/>
+              <w:right w:val="single" w:color="BFBFBF" w:sz="4"/>
+            </w:tcBorders>
+            <w:tcMar>
+              <w:top w:type="dxa" w:w="40"/>
+              <w:left w:type="dxa" w:w="80"/>
+              <w:bottom w:type="dxa" w:w="40"/>
+              <w:right w:type="dxa" w:w="80"/>
+            </w:tcMar>
+          </w:tcPr>
+          <w:p>
+            <w:pPr>
+              <w:jc w:val="left"/>
+            </w:pPr>
+            <w:r>
+              <w:rPr>
+                <w:rFonts w:ascii="Times New Roman" w:cs="Times New Roman" w:eastAsia="Times New Roman" w:hAnsi="Times New Roman"/>
+                <w:sz w:val="20"/>
+                <w:szCs w:val="20"/>
+              </w:rPr>
+              <w:t xml:space="preserve">Rule-based validation engine (parser, validator, roster checks, saving of grades)</w:t>
+            </w:r>
+          </w:p>
+        </w:tc>
+        <w:tc>
+          <w:tcPr>
+            <w:tcW w:type="pct" w:w="15%"/>
+            <w:tcBorders>
+              <w:top w:val="single" w:color="BFBFBF" w:sz="4"/>
+              <w:left w:val="single" w:color="BFBFBF" w:sz="4"/>
+              <w:bottom w:val="single" w:color="BFBFBF" w:sz="4"/>
+              <w:right w:val="single" w:color="BFBFBF" w:sz="4"/>
+            </w:tcBorders>
+            <w:tcMar>
+              <w:top w:type="dxa" w:w="40"/>
+              <w:left w:type="dxa" w:w="80"/>
+              <w:bottom w:type="dxa" w:w="40"/>
+              <w:right w:type="dxa" w:w="80"/>
+            </w:tcMar>
+          </w:tcPr>
+          <w:p>
+            <w:pPr>
+              <w:jc w:val="center"/>
+            </w:pPr>
+            <w:r>
+              <w:rPr>
+                <w:rFonts w:ascii="Times New Roman" w:cs="Times New Roman" w:eastAsia="Times New Roman" w:hAnsi="Times New Roman"/>
+                <w:sz w:val="20"/>
+                <w:szCs w:val="20"/>
+              </w:rPr>
+              <w:t xml:space="preserve">99.63%</w:t>
+            </w:r>
+          </w:p>
+        </w:tc>
+        <w:tc>
+          <w:tcPr>
+            <w:tcW w:type="pct" w:w="15%"/>
+            <w:tcBorders>
+              <w:top w:val="single" w:color="BFBFBF" w:sz="4"/>
+              <w:left w:val="single" w:color="BFBFBF" w:sz="4"/>
+              <w:bottom w:val="single" w:color="BFBFBF" w:sz="4"/>
+              <w:right w:val="single" w:color="BFBFBF" w:sz="4"/>
+            </w:tcBorders>
+            <w:tcMar>
+              <w:top w:type="dxa" w:w="40"/>
+              <w:left w:type="dxa" w:w="80"/>
+              <w:bottom w:type="dxa" w:w="40"/>
+              <w:right w:type="dxa" w:w="80"/>
+            </w:tcMar>
+          </w:tcPr>
+          <w:p>
+            <w:pPr>
+              <w:jc w:val="center"/>
+            </w:pPr>
+            <w:r>
+              <w:rPr>
+                <w:rFonts w:ascii="Times New Roman" w:cs="Times New Roman" w:eastAsia="Times New Roman" w:hAnsi="Times New Roman"/>
+                <w:sz w:val="20"/>
+                <w:szCs w:val="20"/>
+              </w:rPr>
+              <w:t xml:space="preserve">90.69%</w:t>
+            </w:r>
+          </w:p>
+        </w:tc>
+        <w:tc>
+          <w:tcPr>
+            <w:tcW w:type="pct" w:w="15%"/>
+            <w:tcBorders>
+              <w:top w:val="single" w:color="BFBFBF" w:sz="4"/>
+              <w:left w:val="single" w:color="BFBFBF" w:sz="4"/>
+              <w:bottom w:val="single" w:color="BFBFBF" w:sz="4"/>
+              <w:right w:val="single" w:color="BFBFBF" w:sz="4"/>
+            </w:tcBorders>
+            <w:tcMar>
+              <w:top w:type="dxa" w:w="40"/>
+              <w:left w:type="dxa" w:w="80"/>
+              <w:bottom w:type="dxa" w:w="40"/>
+              <w:right w:type="dxa" w:w="80"/>
+            </w:tcMar>
+          </w:tcPr>
+          <w:p>
+            <w:pPr>
+              <w:jc w:val="center"/>
+            </w:pPr>
+            <w:r>
+              <w:rPr>
+                <w:rFonts w:ascii="Times New Roman" w:cs="Times New Roman" w:eastAsia="Times New Roman" w:hAnsi="Times New Roman"/>
+                <w:sz w:val="20"/>
+                <w:szCs w:val="20"/>
+              </w:rPr>
+              <w:t xml:space="preserve">100.00%</w:t>
+            </w:r>
+          </w:p>
+        </w:tc>
+      </w:tr>
+      <w:tr>
+        <w:trPr>
+          <w:cantSplit/>
+        </w:trPr>
+        <w:tc>
+          <w:tcPr>
+            <w:tcW w:type="pct" w:w="55%"/>
+            <w:tcBorders>
+              <w:top w:val="single" w:color="BFBFBF" w:sz="4"/>
+              <w:left w:val="single" w:color="BFBFBF" w:sz="4"/>
+              <w:bottom w:val="single" w:color="BFBFBF" w:sz="4"/>
+              <w:right w:val="single" w:color="BFBFBF" w:sz="4"/>
+            </w:tcBorders>
+            <w:tcMar>
+              <w:top w:type="dxa" w:w="40"/>
+              <w:left w:type="dxa" w:w="80"/>
+              <w:bottom w:type="dxa" w:w="40"/>
+              <w:right w:type="dxa" w:w="80"/>
+            </w:tcMar>
+          </w:tcPr>
+          <w:p>
+            <w:pPr>
+              <w:jc w:val="left"/>
+            </w:pPr>
+            <w:r>
+              <w:rPr>
+                <w:rFonts w:ascii="Times New Roman" w:cs="Times New Roman" w:eastAsia="Times New Roman" w:hAnsi="Times New Roman"/>
+                <w:sz w:val="20"/>
+                <w:szCs w:val="20"/>
+              </w:rPr>
+              <w:t xml:space="preserve">SF10 generation and import</w:t>
+            </w:r>
+          </w:p>
+        </w:tc>
+        <w:tc>
+          <w:tcPr>
+            <w:tcW w:type="pct" w:w="15%"/>
+            <w:tcBorders>
+              <w:top w:val="single" w:color="BFBFBF" w:sz="4"/>
+              <w:left w:val="single" w:color="BFBFBF" w:sz="4"/>
+              <w:bottom w:val="single" w:color="BFBFBF" w:sz="4"/>
+              <w:right w:val="single" w:color="BFBFBF" w:sz="4"/>
+            </w:tcBorders>
+            <w:tcMar>
+              <w:top w:type="dxa" w:w="40"/>
+              <w:left w:type="dxa" w:w="80"/>
+              <w:bottom w:type="dxa" w:w="40"/>
+              <w:right w:type="dxa" w:w="80"/>
+            </w:tcMar>
+          </w:tcPr>
+          <w:p>
+            <w:pPr>
+              <w:jc w:val="center"/>
+            </w:pPr>
+            <w:r>
+              <w:rPr>
+                <w:rFonts w:ascii="Times New Roman" w:cs="Times New Roman" w:eastAsia="Times New Roman" w:hAnsi="Times New Roman"/>
+                <w:sz w:val="20"/>
+                <w:szCs w:val="20"/>
+              </w:rPr>
+              <w:t xml:space="preserve">93.37%</w:t>
+            </w:r>
+          </w:p>
+        </w:tc>
+        <w:tc>
+          <w:tcPr>
+            <w:tcW w:type="pct" w:w="15%"/>
+            <w:tcBorders>
+              <w:top w:val="single" w:color="BFBFBF" w:sz="4"/>
+              <w:left w:val="single" w:color="BFBFBF" w:sz="4"/>
+              <w:bottom w:val="single" w:color="BFBFBF" w:sz="4"/>
+              <w:right w:val="single" w:color="BFBFBF" w:sz="4"/>
+            </w:tcBorders>
+            <w:tcMar>
+              <w:top w:type="dxa" w:w="40"/>
+              <w:left w:type="dxa" w:w="80"/>
+              <w:bottom w:type="dxa" w:w="40"/>
+              <w:right w:type="dxa" w:w="80"/>
+            </w:tcMar>
+          </w:tcPr>
+          <w:p>
+            <w:pPr>
+              <w:jc w:val="center"/>
+            </w:pPr>
+            <w:r>
+              <w:rPr>
+                <w:rFonts w:ascii="Times New Roman" w:cs="Times New Roman" w:eastAsia="Times New Roman" w:hAnsi="Times New Roman"/>
+                <w:sz w:val="20"/>
+                <w:szCs w:val="20"/>
+              </w:rPr>
+              <w:t xml:space="preserve">79.41%</w:t>
+            </w:r>
+          </w:p>
+        </w:tc>
+        <w:tc>
+          <w:tcPr>
+            <w:tcW w:type="pct" w:w="15%"/>
+            <w:tcBorders>
+              <w:top w:val="single" w:color="BFBFBF" w:sz="4"/>
+              <w:left w:val="single" w:color="BFBFBF" w:sz="4"/>
+              <w:bottom w:val="single" w:color="BFBFBF" w:sz="4"/>
+              <w:right w:val="single" w:color="BFBFBF" w:sz="4"/>
+            </w:tcBorders>
+            <w:tcMar>
+              <w:top w:type="dxa" w:w="40"/>
+              <w:left w:type="dxa" w:w="80"/>
+              <w:bottom w:type="dxa" w:w="40"/>
+              <w:right w:type="dxa" w:w="80"/>
+            </w:tcMar>
+          </w:tcPr>
+          <w:p>
+            <w:pPr>
+              <w:jc w:val="center"/>
+            </w:pPr>
+            <w:r>
+              <w:rPr>
+                <w:rFonts w:ascii="Times New Roman" w:cs="Times New Roman" w:eastAsia="Times New Roman" w:hAnsi="Times New Roman"/>
+                <w:sz w:val="20"/>
+                <w:szCs w:val="20"/>
+              </w:rPr>
+              <w:t xml:space="preserve">97.82%</w:t>
+            </w:r>
+          </w:p>
+        </w:tc>
+      </w:tr>
+      <w:tr>
+        <w:trPr>
+          <w:cantSplit/>
+        </w:trPr>
+        <w:tc>
+          <w:tcPr>
+            <w:tcW w:type="pct" w:w="55%"/>
+            <w:tcBorders>
+              <w:top w:val="single" w:color="BFBFBF" w:sz="4"/>
+              <w:left w:val="single" w:color="BFBFBF" w:sz="4"/>
+              <w:bottom w:val="single" w:color="BFBFBF" w:sz="4"/>
+              <w:right w:val="single" w:color="BFBFBF" w:sz="4"/>
+            </w:tcBorders>
+            <w:tcMar>
+              <w:top w:type="dxa" w:w="40"/>
+              <w:left w:type="dxa" w:w="80"/>
+              <w:bottom w:type="dxa" w:w="40"/>
+              <w:right w:type="dxa" w:w="80"/>
+            </w:tcMar>
+          </w:tcPr>
+          <w:p>
+            <w:pPr>
+              <w:jc w:val="left"/>
+            </w:pPr>
+            <w:r>
+              <w:rPr>
+                <w:rFonts w:ascii="Times New Roman" w:cs="Times New Roman" w:eastAsia="Times New Roman" w:hAnsi="Times New Roman"/>
+                <w:b/>
+                <w:bCs/>
+                <w:sz w:val="20"/>
+                <w:szCs w:val="20"/>
+              </w:rPr>
+              <w:t xml:space="preserve">All server code</w:t>
+            </w:r>
+          </w:p>
+        </w:tc>
+        <w:tc>
+          <w:tcPr>
+            <w:tcW w:type="pct" w:w="15%"/>
+            <w:tcBorders>
+              <w:top w:val="single" w:color="BFBFBF" w:sz="4"/>
+              <w:left w:val="single" w:color="BFBFBF" w:sz="4"/>
+              <w:bottom w:val="single" w:color="BFBFBF" w:sz="4"/>
+              <w:right w:val="single" w:color="BFBFBF" w:sz="4"/>
+            </w:tcBorders>
+            <w:tcMar>
+              <w:top w:type="dxa" w:w="40"/>
+              <w:left w:type="dxa" w:w="80"/>
+              <w:bottom w:type="dxa" w:w="40"/>
+              <w:right w:type="dxa" w:w="80"/>
+            </w:tcMar>
+          </w:tcPr>
+          <w:p>
+            <w:pPr>
+              <w:jc w:val="center"/>
+            </w:pPr>
+            <w:r>
+              <w:rPr>
+                <w:rFonts w:ascii="Times New Roman" w:cs="Times New Roman" w:eastAsia="Times New Roman" w:hAnsi="Times New Roman"/>
+                <w:b/>
+                <w:bCs/>
+                <w:sz w:val="20"/>
+                <w:szCs w:val="20"/>
+              </w:rPr>
+              <w:t xml:space="preserve">85.45%</w:t>
+            </w:r>
+          </w:p>
+        </w:tc>
+        <w:tc>
+          <w:tcPr>
+            <w:tcW w:type="pct" w:w="15%"/>
+            <w:tcBorders>
+              <w:top w:val="single" w:color="BFBFBF" w:sz="4"/>
+              <w:left w:val="single" w:color="BFBFBF" w:sz="4"/>
+              <w:bottom w:val="single" w:color="BFBFBF" w:sz="4"/>
+              <w:right w:val="single" w:color="BFBFBF" w:sz="4"/>
+            </w:tcBorders>
+            <w:tcMar>
+              <w:top w:type="dxa" w:w="40"/>
+              <w:left w:type="dxa" w:w="80"/>
+              <w:bottom w:type="dxa" w:w="40"/>
+              <w:right w:type="dxa" w:w="80"/>
+            </w:tcMar>
+          </w:tcPr>
+          <w:p>
+            <w:pPr>
+              <w:jc w:val="center"/>
+            </w:pPr>
+            <w:r>
+              <w:rPr>
+                <w:rFonts w:ascii="Times New Roman" w:cs="Times New Roman" w:eastAsia="Times New Roman" w:hAnsi="Times New Roman"/>
+                <w:b/>
+                <w:bCs/>
+                <w:sz w:val="20"/>
+                <w:szCs w:val="20"/>
+              </w:rPr>
+              <w:t xml:space="preserve">80.95%</w:t>
+            </w:r>
+          </w:p>
+        </w:tc>
+        <w:tc>
+          <w:tcPr>
+            <w:tcW w:type="pct" w:w="15%"/>
+            <w:tcBorders>
+              <w:top w:val="single" w:color="BFBFBF" w:sz="4"/>
+              <w:left w:val="single" w:color="BFBFBF" w:sz="4"/>
+              <w:bottom w:val="single" w:color="BFBFBF" w:sz="4"/>
+              <w:right w:val="single" w:color="BFBFBF" w:sz="4"/>
+            </w:tcBorders>
+            <w:tcMar>
+              <w:top w:type="dxa" w:w="40"/>
+              <w:left w:type="dxa" w:w="80"/>
+              <w:bottom w:type="dxa" w:w="40"/>
+              <w:right w:type="dxa" w:w="80"/>
+            </w:tcMar>
+          </w:tcPr>
+          <w:p>
+            <w:pPr>
+              <w:jc w:val="center"/>
+            </w:pPr>
+            <w:r>
+              <w:rPr>
+                <w:rFonts w:ascii="Times New Roman" w:cs="Times New Roman" w:eastAsia="Times New Roman" w:hAnsi="Times New Roman"/>
+                <w:b/>
+                <w:bCs/>
+                <w:sz w:val="20"/>
+                <w:szCs w:val="20"/>
+              </w:rPr>
+              <w:t xml:space="preserve">91.18%</w:t>
+            </w:r>
+          </w:p>
+        </w:tc>
+      </w:tr>
+    </w:tbl>
     <w:p>
       <w:pPr>
         <w:pStyle w:val="Heading2"/>
@@ -2362,7 +2932,7 @@
           <w:sz w:val="22"/>
           <w:szCs w:val="22"/>
         </w:rPr>
-        <w:t xml:space="preserve">Table 3. Profile of the respondents</w:t>
+        <w:t xml:space="preserve">Table 4. Profile of the respondents</w:t>
       </w:r>
     </w:p>
     <w:tbl>
@@ -3308,7 +3878,7 @@
           <w:sz w:val="24"/>
           <w:szCs w:val="24"/>
         </w:rPr>
-        <w:t xml:space="preserve">The respondents rated each statement on a five-point Likert scale [ref: ISO/IEC 25010]. The weighted mean of each statement and characteristic was interpreted using Table 4. Answers of N/A were excluded from the mean. School personnel rated six characteristics; the IT expert also rated the four technical characteristics (maintainability, portability, safety, and technical security), which the questionnaire asked IT experts to answer after reviewing the setup guide and the source code.</w:t>
+        <w:t xml:space="preserve">The respondents rated each statement on a five-point Likert scale [ref: ISO/IEC 25010]. The weighted mean of each statement and characteristic was interpreted using Table 5. Answers of N/A were excluded from the mean. School personnel rated six characteristics; the IT expert also rated the four technical characteristics (maintainability, portability, safety, and technical security), which the questionnaire asked IT experts to answer after reviewing the setup guide and the source code.</w:t>
       </w:r>
     </w:p>
     <w:p>
@@ -3324,7 +3894,7 @@
           <w:sz w:val="22"/>
           <w:szCs w:val="22"/>
         </w:rPr>
-        <w:t xml:space="preserve">Table 4. Interpretation of the weighted mean</w:t>
+        <w:t xml:space="preserve">Table 5. Interpretation of the weighted mean</w:t>
       </w:r>
     </w:p>
     <w:tbl>
@@ -3937,7 +4507,7 @@
           <w:sz w:val="22"/>
           <w:szCs w:val="22"/>
         </w:rPr>
-        <w:t xml:space="preserve">Table 5. Summary of the ISO/IEC 25010 evaluation by characteristic</w:t>
+        <w:t xml:space="preserve">Table 6. Summary of the ISO/IEC 25010 evaluation by characteristic</w:t>
       </w:r>
     </w:p>
     <w:tbl>
@@ -5873,7 +6443,7 @@
           <w:sz w:val="22"/>
           <w:szCs w:val="22"/>
         </w:rPr>
-        <w:t xml:space="preserve">Table 6. Functional Suitability</w:t>
+        <w:t xml:space="preserve">Table 7. Functional Suitability</w:t>
       </w:r>
     </w:p>
     <w:tbl>
@@ -7053,7 +7623,7 @@
           <w:sz w:val="22"/>
           <w:szCs w:val="22"/>
         </w:rPr>
-        <w:t xml:space="preserve">Table 7. Performance Efficiency</w:t>
+        <w:t xml:space="preserve">Table 8. Performance Efficiency</w:t>
       </w:r>
     </w:p>
     <w:tbl>
@@ -7858,7 +8428,7 @@
           <w:sz w:val="22"/>
           <w:szCs w:val="22"/>
         </w:rPr>
-        <w:t xml:space="preserve">Table 8. Compatibility</w:t>
+        <w:t xml:space="preserve">Table 9. Compatibility</w:t>
       </w:r>
     </w:p>
     <w:tbl>
@@ -8663,7 +9233,7 @@
           <w:sz w:val="22"/>
           <w:szCs w:val="22"/>
         </w:rPr>
-        <w:t xml:space="preserve">Table 9. Usability (Interaction Capability)</w:t>
+        <w:t xml:space="preserve">Table 10. Usability (Interaction Capability)</w:t>
       </w:r>
     </w:p>
     <w:tbl>
@@ -9843,7 +10413,7 @@
           <w:sz w:val="22"/>
           <w:szCs w:val="22"/>
         </w:rPr>
-        <w:t xml:space="preserve">Table 10. Security</w:t>
+        <w:t xml:space="preserve">Table 11. Security</w:t>
       </w:r>
     </w:p>
     <w:tbl>
@@ -10773,7 +11343,7 @@
           <w:sz w:val="22"/>
           <w:szCs w:val="22"/>
         </w:rPr>
-        <w:t xml:space="preserve">Table 11. Reliability</w:t>
+        <w:t xml:space="preserve">Table 12. Reliability</w:t>
       </w:r>
     </w:p>
     <w:tbl>
@@ -11578,7 +12148,7 @@
           <w:sz w:val="22"/>
           <w:szCs w:val="22"/>
         </w:rPr>
-        <w:t xml:space="preserve">Table 12. Maintainability</w:t>
+        <w:t xml:space="preserve">Table 13. Maintainability</w:t>
       </w:r>
     </w:p>
     <w:tbl>
@@ -12292,7 +12862,7 @@
           <w:sz w:val="22"/>
           <w:szCs w:val="22"/>
         </w:rPr>
-        <w:t xml:space="preserve">Table 13. Portability (Flexibility)</w:t>
+        <w:t xml:space="preserve">Table 14. Portability (Flexibility)</w:t>
       </w:r>
     </w:p>
     <w:tbl>
@@ -12911,7 +13481,7 @@
           <w:sz w:val="22"/>
           <w:szCs w:val="22"/>
         </w:rPr>
-        <w:t xml:space="preserve">Table 14. Safety</w:t>
+        <w:t xml:space="preserve">Table 15. Safety</w:t>
       </w:r>
     </w:p>
     <w:tbl>
@@ -13435,7 +14005,7 @@
           <w:sz w:val="22"/>
           <w:szCs w:val="22"/>
         </w:rPr>
-        <w:t xml:space="preserve">Table 15. Security (Technical)</w:t>
+        <w:t xml:space="preserve">Table 16. Security (Technical)</w:t>
       </w:r>
     </w:p>
     <w:tbl>
@@ -14243,7 +14813,7 @@
           <w:sz w:val="22"/>
           <w:szCs w:val="22"/>
         </w:rPr>
-        <w:t xml:space="preserve">Table 16. SUS score of the respondents</w:t>
+        <w:t xml:space="preserve">Table 17. SUS score of the respondents</w:t>
       </w:r>
     </w:p>
     <w:tbl>
@@ -14741,7 +15311,7 @@
           <w:sz w:val="22"/>
           <w:szCs w:val="22"/>
         </w:rPr>
-        <w:t xml:space="preserve">Table 17. Distribution of the SUS scores</w:t>
+        <w:t xml:space="preserve">Table 18. Distribution of the SUS scores</w:t>
       </w:r>
     </w:p>
     <w:tbl>
@@ -15413,7 +15983,7 @@
           <w:sz w:val="22"/>
           <w:szCs w:val="22"/>
         </w:rPr>
-        <w:t xml:space="preserve">Table 18. Mean SUS score by respondent group</w:t>
+        <w:t xml:space="preserve">Table 19. Mean SUS score by respondent group</w:t>
       </w:r>
     </w:p>
     <w:tbl>
@@ -15946,7 +16516,7 @@
           <w:sz w:val="22"/>
           <w:szCs w:val="22"/>
         </w:rPr>
-        <w:t xml:space="preserve">Table 19. Mean answer per SUS statement</w:t>
+        <w:t xml:space="preserve">Table 20. Mean answer per SUS statement</w:t>
       </w:r>
     </w:p>
     <w:tbl>
@@ -17111,7 +17681,7 @@
           <w:sz w:val="22"/>
           <w:szCs w:val="22"/>
         </w:rPr>
-        <w:t xml:space="preserve">Table 20. Results of the heuristic evaluation</w:t>
+        <w:t xml:space="preserve">Table 21. Results of the heuristic evaluation</w:t>
       </w:r>
     </w:p>
     <w:tbl>

</xml_diff>